<commit_message>
Removed old test plan from baseline
</commit_message>
<xml_diff>
--- a/documentation/Meeting Logs/Baseline Sprint 4.docx
+++ b/documentation/Meeting Logs/Baseline Sprint 4.docx
@@ -5615,6 +5615,22 @@
           <w:szCs w:val="32"/>
         </w:rPr>
       </w:pPr>
+    </w:p>
+    <w:p>
+      <w:pPr>
+        <w:rPr>
+          <w:sz w:val="32"/>
+          <w:szCs w:val="32"/>
+        </w:rPr>
+      </w:pPr>
+    </w:p>
+    <w:p>
+      <w:pPr>
+        <w:rPr>
+          <w:sz w:val="32"/>
+          <w:szCs w:val="32"/>
+        </w:rPr>
+      </w:pPr>
       <w:r>
         <w:rPr>
           <w:b/>
@@ -5622,33 +5638,8 @@
           <w:sz w:val="32"/>
           <w:szCs w:val="32"/>
         </w:rPr>
-        <w:t>Test Data:</w:t>
-      </w:r>
-    </w:p>
-    <w:p>
-      <w:r>
-        <w:t>A seeded station dataset with:</w:t>
-      </w:r>
-    </w:p>
-    <w:p>
-      <w:r>
         <w:lastRenderedPageBreak/>
-        <w:t>Multiple stations, fuel types, prices, and varied distances</w:t>
-      </w:r>
-    </w:p>
-    <w:p>
-      <w:r>
-        <w:t>Some missing or invalid API fields for validation tests</w:t>
-      </w:r>
-    </w:p>
-    <w:p>
-      <w:r>
-        <w:t>Discount programs matching specific stations</w:t>
-      </w:r>
-    </w:p>
-    <w:p>
-      <w:r>
-        <w:t>Cached snapshot with timestamps</w:t>
+        <w:t>Quality Assurance Metrics</w:t>
       </w:r>
     </w:p>
     <w:p>
@@ -5657,12 +5648,12 @@
           <w:b/>
           <w:bCs/>
         </w:rPr>
-        <w:t>Test Environment:</w:t>
-      </w:r>
-    </w:p>
-    <w:p>
-      <w:r>
-        <w:t>The testing environments will be finalized by the end of sprint 2. It will most likely include multiple browser types, device types, online and offline modes, and location services allowed and blocked.</w:t>
+        <w:t>Design metric:</w:t>
+      </w:r>
+    </w:p>
+    <w:p>
+      <w:r>
+        <w:t>The design metric chosen for Find a Pump is high cohesion. This will be achieved by clearly dividing responsibilities and ensuring that each module has a single, well-defined purpose. High cohesion improves maintainability, makes the system easier to understand, and helps isolate defects, which in turn facilitates faster debugging and more reliable enhancements.</w:t>
       </w:r>
     </w:p>
     <w:p>
@@ -5671,81 +5662,6 @@
           <w:b/>
           <w:bCs/>
         </w:rPr>
-        <w:t>Test Cases:</w:t>
-      </w:r>
-    </w:p>
-    <w:p>
-      <w:r>
-        <w:t>Test cases will be finalized by the end of sprint 2. They will cover the expected scope of the testing plan with pass/fail information included.</w:t>
-      </w:r>
-    </w:p>
-    <w:p>
-      <w:r>
-        <w:rPr>
-          <w:b/>
-          <w:bCs/>
-        </w:rPr>
-        <w:t>Pass/Fail Criteria:</w:t>
-      </w:r>
-    </w:p>
-    <w:p>
-      <w:r>
-        <w:t>Functional: 100% of functional test cases must pass.</w:t>
-      </w:r>
-    </w:p>
-    <w:p>
-      <w:r>
-        <w:t>Non-functional: Must meet defined thresholds</w:t>
-      </w:r>
-    </w:p>
-    <w:p>
-      <w:r>
-        <w:t>Any crash on common user flow is a fail.</w:t>
-      </w:r>
-    </w:p>
-    <w:p>
-      <w:r>
-        <w:rPr>
-          <w:b/>
-          <w:bCs/>
-        </w:rPr>
-        <w:t>Schedule:</w:t>
-      </w:r>
-    </w:p>
-    <w:p>
-      <w:r>
-        <w:t>This testing plan will be finalized by the end of sprint 2. The unit testing and integration testing will be performed in sprint 3. System testing and non-functional testing will be carried out in sprint number 4.</w:t>
-      </w:r>
-    </w:p>
-    <w:p>
-      <w:r>
-        <w:rPr>
-          <w:b/>
-          <w:bCs/>
-        </w:rPr>
-        <w:t>Quality Assurance Metrics</w:t>
-      </w:r>
-    </w:p>
-    <w:p>
-      <w:r>
-        <w:rPr>
-          <w:b/>
-          <w:bCs/>
-        </w:rPr>
-        <w:t>Design metric:</w:t>
-      </w:r>
-    </w:p>
-    <w:p>
-      <w:r>
-        <w:t>The design metric chosen for Find a Pump is high cohesion. This will be achieved by clearly dividing responsibilities and ensuring that each module has a single, well-defined purpose. High cohesion improves maintainability, makes the system easier to understand, and helps isolate defects, which in turn facilitates faster debugging and more reliable enhancements.</w:t>
-      </w:r>
-    </w:p>
-    <w:p>
-      <w:r>
-        <w:rPr>
-          <w:b/>
-          <w:bCs/>
-        </w:rPr>
         <w:t>Testing metric:</w:t>
       </w:r>
     </w:p>
@@ -5754,11 +5670,7 @@
         <w:t> </w:t>
       </w:r>
       <w:r>
-        <w:t xml:space="preserve">The chosen testing metric for Find a Pump is testing pass rate. The project will track the percentage of automated and manual tests that are passed during each test cycle. The goal </w:t>
-      </w:r>
-      <w:r>
-        <w:lastRenderedPageBreak/>
-        <w:t>is to maintain a 100% pass rate before release to ensure that core functionality remains stable and that regressions are caught early.</w:t>
+        <w:t>The chosen testing metric for Find a Pump is testing pass rate. The project will track the percentage of automated and manual tests that are passed during each test cycle. The goal is to maintain a 100% pass rate before release to ensure that core functionality remains stable and that regressions are caught early.</w:t>
       </w:r>
     </w:p>
     <w:p>
@@ -5917,6 +5829,7 @@
           <w:kern w:val="0"/>
           <w14:ligatures w14:val="none"/>
         </w:rPr>
+        <w:lastRenderedPageBreak/>
         <w:t>Project Overview</w:t>
       </w:r>
     </w:p>
@@ -6273,7 +6186,6 @@
           <w:lang w:val="fr-FR"/>
           <w14:ligatures w14:val="none"/>
         </w:rPr>
-        <w:lastRenderedPageBreak/>
         <w:t>│</w:t>
       </w:r>
     </w:p>
@@ -7321,6 +7233,7 @@
           <w:kern w:val="0"/>
           <w14:ligatures w14:val="none"/>
         </w:rPr>
+        <w:lastRenderedPageBreak/>
         <w:t>Note: A valid Google Maps JavaScript API key is required for the map to render properly.</w:t>
       </w:r>
     </w:p>
@@ -7739,7 +7652,6 @@
           <w:kern w:val="0"/>
           <w14:ligatures w14:val="none"/>
         </w:rPr>
-        <w:lastRenderedPageBreak/>
         <w:t>Viewing the Database (Optional)</w:t>
       </w:r>
     </w:p>
@@ -8543,6 +8455,7 @@
           <w:kern w:val="0"/>
           <w14:ligatures w14:val="none"/>
         </w:rPr>
+        <w:lastRenderedPageBreak/>
         <w:t>Automated Testing Guide: documentation/Testing Docs/AUTOMATED_TESTING.md</w:t>
       </w:r>
     </w:p>
@@ -8640,7 +8553,6 @@
           <w:sz w:val="32"/>
           <w:szCs w:val="32"/>
         </w:rPr>
-        <w:lastRenderedPageBreak/>
         <w:t xml:space="preserve">Backlog and Sprints Appendix (b) </w:t>
       </w:r>
     </w:p>
@@ -9551,23 +9463,8 @@
                 <w:szCs w:val="28"/>
                 <w14:ligatures w14:val="none"/>
               </w:rPr>
-              <w:t>Project Description (Tech stack and measuring success)</w:t>
-            </w:r>
-          </w:p>
-        </w:tc>
-        <w:tc>
-          <w:tcPr>
-            <w:tcW w:w="1764" w:type="dxa"/>
-            <w:hideMark/>
-          </w:tcPr>
-          <w:p>
-            <w:pPr>
-              <w:rPr>
-                <w:rFonts w:ascii="Times New Roman" w:eastAsia="Times New Roman" w:hAnsi="Times New Roman" w:cs="Times New Roman"/>
-                <w:kern w:val="0"/>
-                <w14:ligatures w14:val="none"/>
-              </w:rPr>
-            </w:pPr>
+              <w:t xml:space="preserve">Project Description (Tech stack </w:t>
+            </w:r>
             <w:r>
               <w:rPr>
                 <w:rFonts w:ascii="Noto Serif CJK SC" w:eastAsia="Times New Roman" w:hAnsi="Noto Serif CJK SC" w:cs="Times New Roman"/>
@@ -9577,13 +9474,14 @@
                 <w:szCs w:val="28"/>
                 <w14:ligatures w14:val="none"/>
               </w:rPr>
-              <w:t>Medium</w:t>
-            </w:r>
-          </w:p>
-        </w:tc>
-        <w:tc>
-          <w:tcPr>
-            <w:tcW w:w="2253" w:type="dxa"/>
+              <w:lastRenderedPageBreak/>
+              <w:t>and measuring success)</w:t>
+            </w:r>
+          </w:p>
+        </w:tc>
+        <w:tc>
+          <w:tcPr>
+            <w:tcW w:w="1764" w:type="dxa"/>
             <w:hideMark/>
           </w:tcPr>
           <w:p>
@@ -9603,13 +9501,14 @@
                 <w:szCs w:val="28"/>
                 <w14:ligatures w14:val="none"/>
               </w:rPr>
-              <w:t>Complete</w:t>
-            </w:r>
-          </w:p>
-        </w:tc>
-        <w:tc>
-          <w:tcPr>
-            <w:tcW w:w="3510" w:type="dxa"/>
+              <w:lastRenderedPageBreak/>
+              <w:t>Medium</w:t>
+            </w:r>
+          </w:p>
+        </w:tc>
+        <w:tc>
+          <w:tcPr>
+            <w:tcW w:w="2253" w:type="dxa"/>
             <w:hideMark/>
           </w:tcPr>
           <w:p>
@@ -9629,6 +9528,32 @@
                 <w:szCs w:val="28"/>
                 <w14:ligatures w14:val="none"/>
               </w:rPr>
+              <w:t>Complete</w:t>
+            </w:r>
+          </w:p>
+        </w:tc>
+        <w:tc>
+          <w:tcPr>
+            <w:tcW w:w="3510" w:type="dxa"/>
+            <w:hideMark/>
+          </w:tcPr>
+          <w:p>
+            <w:pPr>
+              <w:rPr>
+                <w:rFonts w:ascii="Times New Roman" w:eastAsia="Times New Roman" w:hAnsi="Times New Roman" w:cs="Times New Roman"/>
+                <w:kern w:val="0"/>
+                <w14:ligatures w14:val="none"/>
+              </w:rPr>
+            </w:pPr>
+            <w:r>
+              <w:rPr>
+                <w:rFonts w:ascii="Noto Serif CJK SC" w:eastAsia="Times New Roman" w:hAnsi="Noto Serif CJK SC" w:cs="Times New Roman"/>
+                <w:color w:val="000000"/>
+                <w:kern w:val="0"/>
+                <w:sz w:val="28"/>
+                <w:szCs w:val="28"/>
+                <w14:ligatures w14:val="none"/>
+              </w:rPr>
               <w:t>Eric P</w:t>
             </w:r>
           </w:p>
@@ -10317,7 +10242,6 @@
                 <w:szCs w:val="28"/>
                 <w14:ligatures w14:val="none"/>
               </w:rPr>
-              <w:lastRenderedPageBreak/>
               <w:t>1l</w:t>
             </w:r>
           </w:p>
@@ -11636,6 +11560,7 @@
                 <w:szCs w:val="28"/>
                 <w14:ligatures w14:val="none"/>
               </w:rPr>
+              <w:lastRenderedPageBreak/>
               <w:t>2b</w:t>
             </w:r>
           </w:p>
@@ -12164,7 +12089,6 @@
                 <w:szCs w:val="28"/>
                 <w14:ligatures w14:val="none"/>
               </w:rPr>
-              <w:lastRenderedPageBreak/>
               <w:t>2f</w:t>
             </w:r>
           </w:p>
@@ -13135,7 +13059,15 @@
                 <w:rFonts w:ascii="Noto Serif CJK SC" w:hAnsi="Noto Serif CJK SC"/>
                 <w:color w:val="000000"/>
               </w:rPr>
-              <w:t>Implemented cached station and pricing retrieval to reduce stale data.</w:t>
+              <w:t xml:space="preserve">Implemented cached station and pricing </w:t>
+            </w:r>
+            <w:r>
+              <w:rPr>
+                <w:rFonts w:ascii="Noto Serif CJK SC" w:hAnsi="Noto Serif CJK SC"/>
+                <w:color w:val="000000"/>
+              </w:rPr>
+              <w:lastRenderedPageBreak/>
+              <w:t>retrieval to reduce stale data.</w:t>
             </w:r>
           </w:p>
         </w:tc>
@@ -13157,6 +13089,7 @@
                 <w:rFonts w:ascii="Noto Serif CJK SC" w:hAnsi="Noto Serif CJK SC"/>
                 <w:color w:val="000000"/>
               </w:rPr>
+              <w:lastRenderedPageBreak/>
               <w:t>High</w:t>
             </w:r>
           </w:p>
@@ -13471,37 +13404,28 @@
                 <w:rFonts w:ascii="Noto Serif CJK SC" w:hAnsi="Noto Serif CJK SC"/>
                 <w:color w:val="000000"/>
               </w:rPr>
-              <w:t xml:space="preserve">Added fuel type and fuel </w:t>
-            </w:r>
+              <w:t>Added fuel type and fuel grade filtering for station price sorting.</w:t>
+            </w:r>
+          </w:p>
+        </w:tc>
+        <w:tc>
+          <w:tcPr>
+            <w:tcW w:w="1233" w:type="dxa"/>
+            <w:hideMark/>
+          </w:tcPr>
+          <w:p>
+            <w:pPr>
+              <w:rPr>
+                <w:rFonts w:ascii="Times New Roman" w:eastAsia="Times New Roman" w:hAnsi="Times New Roman" w:cs="Times New Roman"/>
+                <w:kern w:val="0"/>
+                <w14:ligatures w14:val="none"/>
+              </w:rPr>
+            </w:pPr>
             <w:r>
               <w:rPr>
                 <w:rFonts w:ascii="Noto Serif CJK SC" w:hAnsi="Noto Serif CJK SC"/>
                 <w:color w:val="000000"/>
               </w:rPr>
-              <w:lastRenderedPageBreak/>
-              <w:t>grade filtering for station price sorting.</w:t>
-            </w:r>
-          </w:p>
-        </w:tc>
-        <w:tc>
-          <w:tcPr>
-            <w:tcW w:w="1233" w:type="dxa"/>
-            <w:hideMark/>
-          </w:tcPr>
-          <w:p>
-            <w:pPr>
-              <w:rPr>
-                <w:rFonts w:ascii="Times New Roman" w:eastAsia="Times New Roman" w:hAnsi="Times New Roman" w:cs="Times New Roman"/>
-                <w:kern w:val="0"/>
-                <w14:ligatures w14:val="none"/>
-              </w:rPr>
-            </w:pPr>
-            <w:r>
-              <w:rPr>
-                <w:rFonts w:ascii="Noto Serif CJK SC" w:hAnsi="Noto Serif CJK SC"/>
-                <w:color w:val="000000"/>
-              </w:rPr>
-              <w:lastRenderedPageBreak/>
               <w:t>High</w:t>
             </w:r>
           </w:p>
@@ -13928,7 +13852,15 @@
                 <w:rFonts w:ascii="Noto Serif CJK SC" w:hAnsi="Noto Serif CJK SC"/>
                 <w:color w:val="000000"/>
               </w:rPr>
-              <w:t>Completed Sprint 3 documentation updates (baseline, class diagram, and bug report template).</w:t>
+              <w:t xml:space="preserve">Completed Sprint 3 documentation updates (baseline, class diagram, and </w:t>
+            </w:r>
+            <w:r>
+              <w:rPr>
+                <w:rFonts w:ascii="Noto Serif CJK SC" w:hAnsi="Noto Serif CJK SC"/>
+                <w:color w:val="000000"/>
+              </w:rPr>
+              <w:lastRenderedPageBreak/>
+              <w:t>bug report template).</w:t>
             </w:r>
           </w:p>
         </w:tc>
@@ -13950,6 +13882,7 @@
                 <w:rFonts w:ascii="Noto Serif CJK SC" w:hAnsi="Noto Serif CJK SC"/>
                 <w:color w:val="000000"/>
               </w:rPr>
+              <w:lastRenderedPageBreak/>
               <w:t>Medium</w:t>
             </w:r>
           </w:p>
@@ -14608,7 +14541,6 @@
                 <w:kern w:val="0"/>
                 <w14:ligatures w14:val="none"/>
               </w:rPr>
-              <w:lastRenderedPageBreak/>
               <w:t>4d</w:t>
             </w:r>
           </w:p>
@@ -16161,6 +16093,7 @@
           <w:sz w:val="32"/>
           <w:szCs w:val="32"/>
         </w:rPr>
+        <w:lastRenderedPageBreak/>
         <w:t>Contribution Form</w:t>
       </w:r>
       <w:r>

</xml_diff>

<commit_message>
Quality metrics complete, just need maintenance metrics
</commit_message>
<xml_diff>
--- a/documentation/Meeting Logs/Baseline Sprint 4.docx
+++ b/documentation/Meeting Logs/Baseline Sprint 4.docx
@@ -5676,35 +5676,18 @@
       </w:r>
     </w:p>
     <w:p>
-      <w:r>
+      <w:pPr>
         <w:rPr>
           <w:b/>
           <w:bCs/>
         </w:rPr>
-        <w:t>Design metric:</w:t>
-      </w:r>
-    </w:p>
-    <w:p>
-      <w:r>
-        <w:lastRenderedPageBreak/>
-        <w:t>The design metric chosen for Find a Pump is high cohesion. This will be achieved by clearly dividing responsibilities and ensuring that each module has a single, well-defined purpose. High cohesion improves maintainability, makes the system easier to understand, and helps isolate defects, which in turn facilitates faster debugging and more reliable enhancements.</w:t>
-      </w:r>
-    </w:p>
-    <w:p>
+      </w:pPr>
       <w:r>
         <w:rPr>
           <w:b/>
           <w:bCs/>
         </w:rPr>
-        <w:t>Testing metric:</w:t>
-      </w:r>
-    </w:p>
-    <w:p>
-      <w:r>
-        <w:t> </w:t>
-      </w:r>
-      <w:r>
-        <w:t>The chosen testing metric for Find a Pump is testing pass rate. The project will track the percentage of automated and manual tests that are passed during each test cycle. The goal is to maintain a 100% pass rate before release to ensure that core functionality remains stable and that regressions are caught early.</w:t>
+        <w:t>Design metric:</w:t>
       </w:r>
     </w:p>
     <w:p>
@@ -5713,51 +5696,241 @@
           <w:b/>
           <w:bCs/>
         </w:rPr>
-        <w:t>QA metric:</w:t>
-      </w:r>
-    </w:p>
-    <w:p>
-      <w:r>
-        <w:t> </w:t>
-      </w:r>
-      <w:r>
-        <w:t>Find a Pump is committed to maintaining a high defect removal efficiency (DRE) in order to catch as many defects as possible before release. This metric measures the proportion of defects found before deployment compared to those found after release. A high DRE reduces the number of escaped defects and helps ensure a higher quality product for end users.</w:t>
-      </w:r>
-    </w:p>
-    <w:p>
-      <w:r>
+        <w:lastRenderedPageBreak/>
+        <w:t>Goal:</w:t>
+      </w:r>
+    </w:p>
+    <w:p>
+      <w:r>
+        <w:t>The design metric chosen for Find a Pump is high cohesion. This will be achieved by clearly dividing responsibilities and ensuring that each module has a single, well-defined purpose. High cohesion improves maintainability, makes the system easier to understand, and helps isolate defects, which in turn facilitates faster debugging and more reliable enhancements.</w:t>
+      </w:r>
+    </w:p>
+    <w:p>
+      <w:pPr>
         <w:rPr>
           <w:b/>
           <w:bCs/>
         </w:rPr>
-        <w:t>Process metric:</w:t>
-      </w:r>
-    </w:p>
-    <w:p>
-      <w:r>
-        <w:t> </w:t>
-      </w:r>
-      <w:r>
-        <w:t>To ensure that Find a Pump is released in a timely manner, sprint velocity will be monitored and evaluated. Tracking sprint velocity allows the team to measure how much work is completed per sprint, improve planning accuracy, and identify potential slowdowns, while still maintaining a strong focus on quality.</w:t>
-      </w:r>
-    </w:p>
-    <w:p>
+      </w:pPr>
       <w:r>
         <w:rPr>
           <w:b/>
           <w:bCs/>
         </w:rPr>
+        <w:t>Result:</w:t>
+      </w:r>
+    </w:p>
+    <w:p>
+      <w:r>
+        <w:t>Find a Pump has achieved high cohesion by leveraging the routes, controller, services backend architectural design pattern. It also clearly separates functionality between the backend and frontend services. This ensures each module has a single, well-defined purpose and allows the product to be easily maintained.</w:t>
+      </w:r>
+    </w:p>
+    <w:p/>
+    <w:p>
+      <w:pPr>
+        <w:rPr>
+          <w:b/>
+          <w:bCs/>
+        </w:rPr>
+      </w:pPr>
+      <w:r>
+        <w:rPr>
+          <w:b/>
+          <w:bCs/>
+        </w:rPr>
+        <w:t>Testing metric:</w:t>
+      </w:r>
+    </w:p>
+    <w:p>
+      <w:r>
+        <w:rPr>
+          <w:b/>
+          <w:bCs/>
+        </w:rPr>
+        <w:t>Goal:</w:t>
+      </w:r>
+    </w:p>
+    <w:p>
+      <w:r>
+        <w:t>The chosen testing metric for Find a Pump is testing pass rate. The project will track the percentage of automated and manual tests that are passed during each test cycle. The goal is to maintain a 100% pass rate before release to ensure that core functionality remains stable and that regressions are caught early.</w:t>
+      </w:r>
+    </w:p>
+    <w:p>
+      <w:pPr>
+        <w:rPr>
+          <w:b/>
+          <w:bCs/>
+        </w:rPr>
+      </w:pPr>
+      <w:r>
+        <w:rPr>
+          <w:b/>
+          <w:bCs/>
+        </w:rPr>
+        <w:t>Result:</w:t>
+      </w:r>
+    </w:p>
+    <w:p>
+      <w:r>
+        <w:t>In the previous testing cycle performed April 12, 2026, Find a Pump achieved a 100% pass rate for all 18 backend tests and all 13 frontend tests. This ensures that Find a Pump’s core functionality is stable and all new functionality has not caused regression issues.</w:t>
+      </w:r>
+    </w:p>
+    <w:p/>
+    <w:p>
+      <w:pPr>
+        <w:rPr>
+          <w:b/>
+          <w:bCs/>
+        </w:rPr>
+      </w:pPr>
+      <w:r>
+        <w:rPr>
+          <w:b/>
+          <w:bCs/>
+        </w:rPr>
+        <w:t>QA metric:</w:t>
+      </w:r>
+    </w:p>
+    <w:p>
+      <w:r>
+        <w:rPr>
+          <w:b/>
+          <w:bCs/>
+        </w:rPr>
+        <w:t>Goal:</w:t>
+      </w:r>
+    </w:p>
+    <w:p>
+      <w:r>
+        <w:t>Find a Pump is committed to maintaining a high defect removal efficiency (DRE) in order to catch as many defects as possible before release. This metric measures the proportion of defects found before deployment compared to those found after release. A high DRE reduces the number of escaped defects and helps ensure a higher quality product for end users.</w:t>
+      </w:r>
+    </w:p>
+    <w:p>
+      <w:pPr>
+        <w:rPr>
+          <w:b/>
+          <w:bCs/>
+        </w:rPr>
+      </w:pPr>
+      <w:r>
+        <w:rPr>
+          <w:b/>
+          <w:bCs/>
+        </w:rPr>
+        <w:t>Result:</w:t>
+      </w:r>
+    </w:p>
+    <w:p>
+      <w:r>
+        <w:lastRenderedPageBreak/>
+        <w:t xml:space="preserve">As Find a Pump has not currently been released, calculating the DRE is not currently possible. However, Find a Pump is aware of </w:t>
+      </w:r>
+      <w:r>
+        <w:t xml:space="preserve">multiple bugs and is committed to fixing these issues before release. </w:t>
+      </w:r>
+    </w:p>
+    <w:p/>
+    <w:p>
+      <w:pPr>
+        <w:rPr>
+          <w:b/>
+          <w:bCs/>
+        </w:rPr>
+      </w:pPr>
+      <w:r>
+        <w:rPr>
+          <w:b/>
+          <w:bCs/>
+        </w:rPr>
+        <w:t>Process metric:</w:t>
+      </w:r>
+    </w:p>
+    <w:p>
+      <w:r>
+        <w:rPr>
+          <w:b/>
+          <w:bCs/>
+        </w:rPr>
+        <w:t>Goal:</w:t>
+      </w:r>
+    </w:p>
+    <w:p>
+      <w:r>
+        <w:t>To ensure that Find a Pump is released in a timely manner, sprint velocity will be monitored and evaluated. Tracking sprint velocity allows the team to measure how much work is completed per sprint, improve planning accuracy, and identify potential slowdowns, while still maintaining a strong focus on quality.</w:t>
+      </w:r>
+    </w:p>
+    <w:p>
+      <w:pPr>
+        <w:rPr>
+          <w:b/>
+          <w:bCs/>
+        </w:rPr>
+      </w:pPr>
+      <w:r>
+        <w:rPr>
+          <w:b/>
+          <w:bCs/>
+        </w:rPr>
+        <w:t>Result:</w:t>
+      </w:r>
+    </w:p>
+    <w:p>
+      <w:r>
+        <w:t xml:space="preserve">Over the first 3 sprints, the team at Find a Pump was able to complete an average of 12 backlog tasks per sprint. </w:t>
+      </w:r>
+      <w:r>
+        <w:t>This has been a good rate to ensure the amount of work completed per sprint is acceptable, while still providing quality work.</w:t>
+      </w:r>
+      <w:r>
+        <w:t xml:space="preserve"> The majority of tasks was completed in sprint 1 as setting up the project was intensive. From there, the amount of tasks were lower than average as the project was able to follow the momentum of sprint 1.</w:t>
+      </w:r>
+    </w:p>
+    <w:p/>
+    <w:p>
+      <w:pPr>
+        <w:rPr>
+          <w:b/>
+          <w:bCs/>
+        </w:rPr>
+      </w:pPr>
+      <w:r>
+        <w:rPr>
+          <w:b/>
+          <w:bCs/>
+        </w:rPr>
         <w:t>Maintenance metric:</w:t>
       </w:r>
     </w:p>
     <w:p>
       <w:r>
-        <w:t> </w:t>
-      </w:r>
+        <w:rPr>
+          <w:b/>
+          <w:bCs/>
+        </w:rPr>
+        <w:t>Goal:</w:t>
+      </w:r>
+    </w:p>
+    <w:p>
       <w:r>
         <w:t>For maintenance, find a Pump will monitor the size of its maintenance backlog and aim to keep it as small as possible. This will be achieved by consistently prioritizing and addressing bugs, technical debt, and post-release issues, helping ensure long-term stability and maintainability of the system.</w:t>
       </w:r>
     </w:p>
+    <w:p>
+      <w:pPr>
+        <w:rPr>
+          <w:b/>
+          <w:bCs/>
+        </w:rPr>
+      </w:pPr>
+      <w:r>
+        <w:rPr>
+          <w:b/>
+          <w:bCs/>
+        </w:rPr>
+        <w:t>Result:</w:t>
+      </w:r>
+    </w:p>
+    <w:p/>
     <w:p>
       <w:pPr>
         <w:rPr>
@@ -5863,6 +6036,7 @@
           <w:kern w:val="0"/>
           <w14:ligatures w14:val="none"/>
         </w:rPr>
+        <w:lastRenderedPageBreak/>
         <w:t>Project Overview</w:t>
       </w:r>
     </w:p>
@@ -5969,7 +6143,6 @@
           <w:kern w:val="0"/>
           <w14:ligatures w14:val="none"/>
         </w:rPr>
-        <w:lastRenderedPageBreak/>
         <w:t>A SQLite database managed with Prisma ORM</w:t>
       </w:r>
     </w:p>
@@ -7267,6 +7440,7 @@
           <w:kern w:val="0"/>
           <w14:ligatures w14:val="none"/>
         </w:rPr>
+        <w:lastRenderedPageBreak/>
         <w:t>Note: A valid Google Maps JavaScript API key is required for the map to render properly.</w:t>
       </w:r>
     </w:p>
@@ -7379,7 +7553,6 @@
           <w:kern w:val="0"/>
           <w14:ligatures w14:val="none"/>
         </w:rPr>
-        <w:lastRenderedPageBreak/>
         <w:t>pnpm prisma db push</w:t>
       </w:r>
     </w:p>
@@ -8489,6 +8662,7 @@
           <w:kern w:val="0"/>
           <w14:ligatures w14:val="none"/>
         </w:rPr>
+        <w:lastRenderedPageBreak/>
         <w:t>Automated Testing Guide: documentation/Testing Docs/AUTOMATED_TESTING.md</w:t>
       </w:r>
     </w:p>
@@ -9496,23 +9670,8 @@
                 <w:szCs w:val="28"/>
                 <w14:ligatures w14:val="none"/>
               </w:rPr>
-              <w:t>Project Description (Tech stack and measuring success)</w:t>
-            </w:r>
-          </w:p>
-        </w:tc>
-        <w:tc>
-          <w:tcPr>
-            <w:tcW w:w="1764" w:type="dxa"/>
-            <w:hideMark/>
-          </w:tcPr>
-          <w:p>
-            <w:pPr>
-              <w:rPr>
-                <w:rFonts w:ascii="Times New Roman" w:eastAsia="Times New Roman" w:hAnsi="Times New Roman" w:cs="Times New Roman"/>
-                <w:kern w:val="0"/>
-                <w14:ligatures w14:val="none"/>
-              </w:rPr>
-            </w:pPr>
+              <w:t xml:space="preserve">Project Description (Tech stack </w:t>
+            </w:r>
             <w:r>
               <w:rPr>
                 <w:rFonts w:ascii="Noto Serif CJK SC" w:eastAsia="Times New Roman" w:hAnsi="Noto Serif CJK SC" w:cs="Times New Roman"/>
@@ -9522,13 +9681,14 @@
                 <w:szCs w:val="28"/>
                 <w14:ligatures w14:val="none"/>
               </w:rPr>
-              <w:t>Medium</w:t>
-            </w:r>
-          </w:p>
-        </w:tc>
-        <w:tc>
-          <w:tcPr>
-            <w:tcW w:w="2253" w:type="dxa"/>
+              <w:lastRenderedPageBreak/>
+              <w:t>and measuring success)</w:t>
+            </w:r>
+          </w:p>
+        </w:tc>
+        <w:tc>
+          <w:tcPr>
+            <w:tcW w:w="1764" w:type="dxa"/>
             <w:hideMark/>
           </w:tcPr>
           <w:p>
@@ -9548,13 +9708,14 @@
                 <w:szCs w:val="28"/>
                 <w14:ligatures w14:val="none"/>
               </w:rPr>
-              <w:t>Complete</w:t>
-            </w:r>
-          </w:p>
-        </w:tc>
-        <w:tc>
-          <w:tcPr>
-            <w:tcW w:w="3510" w:type="dxa"/>
+              <w:lastRenderedPageBreak/>
+              <w:t>Medium</w:t>
+            </w:r>
+          </w:p>
+        </w:tc>
+        <w:tc>
+          <w:tcPr>
+            <w:tcW w:w="2253" w:type="dxa"/>
             <w:hideMark/>
           </w:tcPr>
           <w:p>
@@ -9574,6 +9735,32 @@
                 <w:szCs w:val="28"/>
                 <w14:ligatures w14:val="none"/>
               </w:rPr>
+              <w:t>Complete</w:t>
+            </w:r>
+          </w:p>
+        </w:tc>
+        <w:tc>
+          <w:tcPr>
+            <w:tcW w:w="3510" w:type="dxa"/>
+            <w:hideMark/>
+          </w:tcPr>
+          <w:p>
+            <w:pPr>
+              <w:rPr>
+                <w:rFonts w:ascii="Times New Roman" w:eastAsia="Times New Roman" w:hAnsi="Times New Roman" w:cs="Times New Roman"/>
+                <w:kern w:val="0"/>
+                <w14:ligatures w14:val="none"/>
+              </w:rPr>
+            </w:pPr>
+            <w:r>
+              <w:rPr>
+                <w:rFonts w:ascii="Noto Serif CJK SC" w:eastAsia="Times New Roman" w:hAnsi="Noto Serif CJK SC" w:cs="Times New Roman"/>
+                <w:color w:val="000000"/>
+                <w:kern w:val="0"/>
+                <w:sz w:val="28"/>
+                <w:szCs w:val="28"/>
+                <w14:ligatures w14:val="none"/>
+              </w:rPr>
               <w:t>Eric P</w:t>
             </w:r>
           </w:p>
@@ -9602,7 +9789,6 @@
                 <w:szCs w:val="28"/>
                 <w14:ligatures w14:val="none"/>
               </w:rPr>
-              <w:lastRenderedPageBreak/>
               <w:t>1g</w:t>
             </w:r>
           </w:p>
@@ -11581,6 +11767,7 @@
                 <w:szCs w:val="28"/>
                 <w14:ligatures w14:val="none"/>
               </w:rPr>
+              <w:lastRenderedPageBreak/>
               <w:t>2b</w:t>
             </w:r>
           </w:p>
@@ -11713,7 +11900,6 @@
                 <w:szCs w:val="28"/>
                 <w14:ligatures w14:val="none"/>
               </w:rPr>
-              <w:lastRenderedPageBreak/>
               <w:t>2c</w:t>
             </w:r>
           </w:p>
@@ -13080,7 +13266,15 @@
                 <w:rFonts w:ascii="Noto Serif CJK SC" w:hAnsi="Noto Serif CJK SC"/>
                 <w:color w:val="000000"/>
               </w:rPr>
-              <w:t>Implemented cached station and pricing retrieval to reduce stale data.</w:t>
+              <w:t xml:space="preserve">Implemented cached station and pricing </w:t>
+            </w:r>
+            <w:r>
+              <w:rPr>
+                <w:rFonts w:ascii="Noto Serif CJK SC" w:hAnsi="Noto Serif CJK SC"/>
+                <w:color w:val="000000"/>
+              </w:rPr>
+              <w:lastRenderedPageBreak/>
+              <w:t>retrieval to reduce stale data.</w:t>
             </w:r>
           </w:p>
         </w:tc>
@@ -13102,6 +13296,7 @@
                 <w:rFonts w:ascii="Noto Serif CJK SC" w:hAnsi="Noto Serif CJK SC"/>
                 <w:color w:val="000000"/>
               </w:rPr>
+              <w:lastRenderedPageBreak/>
               <w:t>High</w:t>
             </w:r>
           </w:p>
@@ -13170,7 +13365,6 @@
                 <w:rFonts w:ascii="Noto Serif CJK SC" w:hAnsi="Noto Serif CJK SC"/>
                 <w:color w:val="000000"/>
               </w:rPr>
-              <w:lastRenderedPageBreak/>
               <w:t>3c</w:t>
             </w:r>
           </w:p>
@@ -13865,7 +14059,15 @@
                 <w:rFonts w:ascii="Noto Serif CJK SC" w:hAnsi="Noto Serif CJK SC"/>
                 <w:color w:val="000000"/>
               </w:rPr>
-              <w:t>Completed Sprint 3 documentation updates (baseline, class diagram, and bug report template).</w:t>
+              <w:t xml:space="preserve">Completed Sprint 3 documentation updates (baseline, class diagram, and </w:t>
+            </w:r>
+            <w:r>
+              <w:rPr>
+                <w:rFonts w:ascii="Noto Serif CJK SC" w:hAnsi="Noto Serif CJK SC"/>
+                <w:color w:val="000000"/>
+              </w:rPr>
+              <w:lastRenderedPageBreak/>
+              <w:t>bug report template).</w:t>
             </w:r>
           </w:p>
         </w:tc>
@@ -13887,6 +14089,7 @@
                 <w:rFonts w:ascii="Noto Serif CJK SC" w:hAnsi="Noto Serif CJK SC"/>
                 <w:color w:val="000000"/>
               </w:rPr>
+              <w:lastRenderedPageBreak/>
               <w:t>Medium</w:t>
             </w:r>
           </w:p>
@@ -13957,7 +14160,6 @@
           <w:sz w:val="32"/>
           <w:szCs w:val="32"/>
         </w:rPr>
-        <w:lastRenderedPageBreak/>
         <w:t>Sprint 4</w:t>
       </w:r>
     </w:p>
@@ -16098,6 +16300,7 @@
           <w:sz w:val="32"/>
           <w:szCs w:val="32"/>
         </w:rPr>
+        <w:lastRenderedPageBreak/>
         <w:t>Contribution Form</w:t>
       </w:r>
       <w:r>
@@ -16205,7 +16408,6 @@
           </w:tcPr>
           <w:p>
             <w:r>
-              <w:lastRenderedPageBreak/>
               <w:t>Name</w:t>
             </w:r>
           </w:p>

</xml_diff>